<commit_message>
docs(backlog): flag Resend SMTP wiring for Supabase Auth
Adds a pre-tester item: wire Resend as the Custom SMTP provider for
Supabase Auth emails. Currently auth emails (signup confirmation,
password reset, magic link) go through Supabase's default service,
which caps at 4 emails/hour project-wide and has poor deliverability —
this blocks the email-confirmation spam gate (7d50527) from being
useful in practice.

Resend is already wired for the Edge Functions (notify-thriver,
log-visit) so the API key + account exist; this is just the dashboard
plumbing on the Auth side.

Step-by-step lives in the checklist + the testplan
(tasks/email-confirmation-gate-2026-05-08-testplan.md). Includes the
Wix root-MX workaround (use mail.distemperverse.com subdomain).

Cost: $0 at launch volume. Resend free tier is 3k/mo.

Regenerated tasks/open-work-2026-05-06.docx so the printable copy is
in sync.

Co-Authored-By: Claude Opus 4.7 (1M context) <noreply@anthropic.com>
</commit_message>
<xml_diff>
--- a/tasks/open-work-2026-05-06.docx
+++ b/tasks/open-work-2026-05-06.docx
@@ -754,6 +754,25 @@
           <w:sz w:val="22"/>
         </w:rPr>
         <w:t>Domain verification spot-check on Resend. FROM swap is in code; confirm outbound mail still lands.</w:t>
+      </w:r>
+    </w:p>
+    <w:p>
+      <w:pPr>
+        <w:spacing w:after="80"/>
+        <w:ind w:left="504" w:hanging="504"/>
+      </w:pPr>
+      <w:r>
+        <w:rPr>
+          <w:rFonts w:ascii="Cambria" w:hAnsi="Cambria"/>
+          <w:sz w:val="26"/>
+        </w:rPr>
+        <w:t xml:space="preserve">☐  </w:t>
+      </w:r>
+      <w:r>
+        <w:rPr>
+          <w:sz w:val="22"/>
+        </w:rPr>
+        <w:t>Wire Resend as Supabase Auth SMTP provider. Auth emails (signup, password reset) currently use Supabase default service - 4/hr cap, poor deliverability. Steps: (a) Resend add domain mail.distemperverse.com (subdomain avoids Wix root-MX limit), add DKIM/SPF DNS in Wix. (b) Supabase Auth -&gt; Emails -&gt; SMTP Settings -&gt; Enable Custom SMTP, host smtp.resend.com:465, user 'resend', password = RESEND_API_KEY, sender noreply@mail.distemperverse.com. (c) Test signup, verify in Resend Logs. Free tier (3k/mo) covers launch. Blocks email-confirmation gate from being usable.</w:t>
       </w:r>
     </w:p>
     <w:p>

</xml_diff>